<commit_message>
Clean project names and documentation, isolate Marburg protocol requirements
</commit_message>
<xml_diff>
--- a/src/photoswitchlab/web/static/materials/protokollvorlage.docx
+++ b/src/photoswitchlab/web/static/materials/protokollvorlage.docx
@@ -15,12 +15,7 @@
         <w:pStyle w:val="Subtitle"/>
       </w:pPr>
       <w:r>
-        <w:t>Struktur, Energie und Absorption im Vergleich</w:t>
-      </w:r>
-    </w:p>
-    <w:p>
-      <w:r>
-        <w:t>ACh-Pr · TC Versuch</w:t>
+        <w:t>Computerexperiment · ACh-PR · Marburg</w:t>
       </w:r>
     </w:p>
     <w:p>
@@ -40,7 +35,7 @@
     </w:p>
     <w:p>
       <w:r>
-        <w:t>Speichern Sie die Datei regelmäßig. Laden Sie das ausgefüllte Protokoll in ILIAS hoch. Die Grundlagen finden Sie unter https://mvondomaros-lab.github.io/achprak/theory/.</w:t>
+        <w:t>Speichern Sie die Datei regelmäßig. Laden Sie das ausgefüllte Protokoll in ILIAS hoch. Die Grundlagen finden Sie unter https://mvondomaros-lab.github.io/photoswitchlab/theory/.</w:t>
       </w:r>
     </w:p>
     <w:p>
@@ -1720,7 +1715,7 @@
                 <w:color w:val="FFFFFF"/>
                 <w:sz w:val="18"/>
               </w:rPr>
-              <w:t>Minimumstruktur</w:t>
+              <w:t>Konfiguration</w:t>
             </w:r>
           </w:p>
         </w:tc>
@@ -5364,7 +5359,7 @@
         <w:color w:val="586B80"/>
         <w:sz w:val="18"/>
       </w:rPr>
-      <w:t xml:space="preserve">ACh-Pr · TC Versuch    |    </w:t>
+      <w:t xml:space="preserve">PhotoSwitchLab · Marburg    |    </w:t>
     </w:r>
     <w:fldSimple w:instr="PAGE"/>
   </w:p>

</xml_diff>

<commit_message>
Clarify MIT software and CC BY-SA educational content licensing
</commit_message>
<xml_diff>
--- a/src/photoswitchlab/web/static/materials/protokollvorlage.docx
+++ b/src/photoswitchlab/web/static/materials/protokollvorlage.docx
@@ -5363,6 +5363,20 @@
     </w:r>
     <w:fldSimple w:instr="PAGE"/>
   </w:p>
+  <w:p>
+    <w:pPr>
+      <w:spacing w:after="0"/>
+    </w:pPr>
+    <w:r>
+      <w:rPr>
+        <w:color w:val="586B80"/>
+        <w:sz w:val="16"/>
+      </w:rPr>
+      <w:t>Vorlage: PhotoSwitchLab · mvondomaros-lab · CC BY-SA 4.0</w:t>
+      <w:br/>
+      <w:t>https://mvondomaros-lab.github.io/photoswitchlab/lizenz/</w:t>
+    </w:r>
+  </w:p>
 </w:ftr>
 </file>
 

</xml_diff>